<commit_message>
Unify authorship, tool versions and terminology for submission
- Authors: Chengyu Xia, Wenhui Chu, Pengbo Ning (corresponding) across
  CITATION.cff, readme citation/BibTeX, LICENSE, version_info.txt; support
  email switched to pbning@xidian.edu.cn
- MUSCLE: pin to v3.8.31 (verified against bin/muscle.exe) in readme,
  THIRD_PARTY_NOTICES (v3 command line primary, v5 auto-detected) and both
  user manuals; BLAST+ 2.12+ -> 2.17.0+ (verified against bin/blastn.exe)
- Terminology: BLASTN+ -> BLAST+ in readme metadata
- readme: tested-environment line (Python 3.13, NumPy 2.5.4, pandas 2.3.3,
  SciPy 1.18.1, Matplotlib 3.11.2) and Illustrative Example numbers synced
  to the revised manuscript (6 representative SNPs, AMOVA 4.63%/Phi 0.0463,
  Arlequin FST 0.0390)
- User manuals rebuilt from markdown with pandoc
</commit_message>
<xml_diff>
--- a/User_Manual_CN.docx
+++ b/User_Manual_CN.docx
@@ -714,7 +714,8 @@
     <w:tbl>
       <w:tblPr>
         <w:tblStyle w:val="Table"/>
-        <w:tblW w:type="auto" w:w="0"/>
+        <w:tblW w:type="pct" w:w="5000"/>
+        <w:tblLayout w:type="fixed"/>
         <w:tblLook w:firstRow="1" w:lastRow="0" w:firstColumn="0" w:lastColumn="0" w:noHBand="0" w:noVBand="0" w:val="0020"/>
       </w:tblPr>
       <w:tblGrid>
@@ -929,7 +930,28 @@
               <w:pStyle w:val="Compact"/>
             </w:pPr>
             <w:r>
-              <w:t xml:space="preserve">MUSCLE v5</w:t>
+              <w:rPr>
+                <w:rFonts w:hint="eastAsia"/>
+              </w:rPr>
+              <w:t xml:space="preserve">MUSCLE（v3.8.31</w:t>
+            </w:r>
+            <w:r>
+              <w:t xml:space="preserve"> </w:t>
+            </w:r>
+            <w:r>
+              <w:rPr>
+                <w:rFonts w:hint="eastAsia"/>
+              </w:rPr>
+              <w:t xml:space="preserve">或</w:t>
+            </w:r>
+            <w:r>
+              <w:t xml:space="preserve"> </w:t>
+            </w:r>
+            <w:r>
+              <w:rPr>
+                <w:rFonts w:hint="eastAsia"/>
+              </w:rPr>
+              <w:t xml:space="preserve">v5）</w:t>
             </w:r>
           </w:p>
         </w:tc>
@@ -946,7 +968,7 @@
               <w:rPr>
                 <w:rFonts w:hint="eastAsia"/>
               </w:rPr>
-              <w:t xml:space="preserve">2.12+（可选，用于基因组坐标映射）</w:t>
+              <w:t xml:space="preserve">2.17.0+（可选，用于基因组坐标映射）</w:t>
             </w:r>
           </w:p>
         </w:tc>
@@ -978,13 +1000,31 @@
           <w:b/>
           <w:bCs/>
         </w:rPr>
-        <w:t xml:space="preserve">MUSCLE v5</w:t>
-      </w:r>
-      <w:r>
-        <w:rPr>
-          <w:rFonts w:hint="eastAsia"/>
-        </w:rPr>
-        <w:t xml:space="preserve">：多序列比对工具，下载地址</w:t>
+        <w:t xml:space="preserve">MUSCLE</w:t>
+      </w:r>
+      <w:r>
+        <w:rPr>
+          <w:rFonts w:hint="eastAsia"/>
+        </w:rPr>
+        <w:t xml:space="preserve">（v3.8.31</w:t>
+      </w:r>
+      <w:r>
+        <w:t xml:space="preserve"> </w:t>
+      </w:r>
+      <w:r>
+        <w:rPr>
+          <w:rFonts w:hint="eastAsia"/>
+        </w:rPr>
+        <w:t xml:space="preserve">或</w:t>
+      </w:r>
+      <w:r>
+        <w:t xml:space="preserve"> </w:t>
+      </w:r>
+      <w:r>
+        <w:rPr>
+          <w:rFonts w:hint="eastAsia"/>
+        </w:rPr>
+        <w:t xml:space="preserve">v5，自动识别）：多序列比对工具，下载地址</w:t>
       </w:r>
       <w:r>
         <w:t xml:space="preserve"> https://www.drive5.com/muscle/</w:t>
@@ -1003,7 +1043,7 @@
           <w:b/>
           <w:bCs/>
         </w:rPr>
-        <w:t xml:space="preserve">BLAST+ 2.12+</w:t>
+        <w:t xml:space="preserve">BLAST+ 2.17.0+</w:t>
       </w:r>
       <w:r>
         <w:rPr>
@@ -7537,7 +7577,7 @@
         </w:numPr>
       </w:pPr>
       <w:r>
-        <w:t xml:space="preserve">MUSCLE v5 (</w:t>
+        <w:t xml:space="preserve">MUSCLE v3.8.31 (</w:t>
       </w:r>
       <w:r>
         <w:rPr>
@@ -8356,7 +8396,31 @@
         <w:t xml:space="preserve">下载</w:t>
       </w:r>
       <w:r>
-        <w:t xml:space="preserve"> MUSCLE v5。</w:t>
+        <w:t xml:space="preserve"> </w:t>
+      </w:r>
+      <w:r>
+        <w:rPr>
+          <w:rFonts w:hint="eastAsia"/>
+        </w:rPr>
+        <w:t xml:space="preserve">MUSCLE（v3.8.31</w:t>
+      </w:r>
+      <w:r>
+        <w:t xml:space="preserve"> </w:t>
+      </w:r>
+      <w:r>
+        <w:rPr>
+          <w:rFonts w:hint="eastAsia"/>
+        </w:rPr>
+        <w:t xml:space="preserve">或</w:t>
+      </w:r>
+      <w:r>
+        <w:t xml:space="preserve"> </w:t>
+      </w:r>
+      <w:r>
+        <w:rPr>
+          <w:rFonts w:hint="eastAsia"/>
+        </w:rPr>
+        <w:t xml:space="preserve">v5）。</w:t>
       </w:r>
     </w:p>
     <w:p>
@@ -8792,7 +8856,7 @@
         <w:t xml:space="preserve">邮箱</w:t>
       </w:r>
       <w:r>
-        <w:t xml:space="preserve">: chengyu.xia@xidian.edu.cn</w:t>
+        <w:t xml:space="preserve">: pbning@xidian.edu.cn</w:t>
       </w:r>
     </w:p>
     <w:p>
@@ -8811,7 +8875,7 @@
           <w:i/>
           <w:iCs/>
         </w:rPr>
-        <w:t xml:space="preserve">ABI-SNP Analyzer v1.1.0 | MIT License | Copyright (c) 2026 Chengyu Xia</w:t>
+        <w:t xml:space="preserve">ABI-SNP Analyzer v1.1.0 | MIT License | Copyright (c) 2026 Chengyu Xia, Wenhui Chu, Pengbo Ning</w:t>
       </w:r>
     </w:p>
     <w:bookmarkEnd w:id="34"/>

</xml_diff>